<commit_message>
Finalized the payment receipt side of the application.
</commit_message>
<xml_diff>
--- a/Receipt_Template.docx
+++ b/Receipt_Template.docx
@@ -8,53 +8,27 @@
       <w:r>
         <w:t xml:space="preserve">Invoice #: </w:t>
       </w:r>
-      <w:r>
-        <w:fldChar w:fldCharType="begin"/>
-      </w:r>
-      <w:r>
-        <w:instrText xml:space="preserve"> MERGEFIELD  Invoice  \* MERGEFORMAT </w:instrText>
-      </w:r>
-      <w:r>
-        <w:fldChar w:fldCharType="separate"/>
-      </w:r>
-      <w:r>
-        <w:rPr>
-          <w:noProof/>
-        </w:rPr>
-        <w:t>«Invoice»</w:t>
-      </w:r>
-      <w:r>
-        <w:rPr>
-          <w:noProof/>
-        </w:rPr>
-        <w:fldChar w:fldCharType="end"/>
-      </w:r>
+      <w:fldSimple w:instr=" MERGEFIELD  Invoice  \* MERGEFORMAT ">
+        <w:r>
+          <w:rPr>
+            <w:noProof/>
+          </w:rPr>
+          <w:t>«Invoice»</w:t>
+        </w:r>
+      </w:fldSimple>
     </w:p>
     <w:p>
       <w:r>
         <w:t xml:space="preserve">System: </w:t>
       </w:r>
-      <w:r>
-        <w:fldChar w:fldCharType="begin"/>
-      </w:r>
-      <w:r>
-        <w:instrText xml:space="preserve"> MERGEFIELD  System  \* MERGEFORMAT </w:instrText>
-      </w:r>
-      <w:r>
-        <w:fldChar w:fldCharType="separate"/>
-      </w:r>
-      <w:r>
-        <w:rPr>
-          <w:noProof/>
-        </w:rPr>
-        <w:t>«System»</w:t>
-      </w:r>
-      <w:r>
-        <w:rPr>
-          <w:noProof/>
-        </w:rPr>
-        <w:fldChar w:fldCharType="end"/>
-      </w:r>
+      <w:fldSimple w:instr=" MERGEFIELD  System  \* MERGEFORMAT ">
+        <w:r>
+          <w:rPr>
+            <w:noProof/>
+          </w:rPr>
+          <w:t>«System»</w:t>
+        </w:r>
+      </w:fldSimple>
     </w:p>
     <w:p>
       <w:pPr>
@@ -63,27 +37,14 @@
       <w:r>
         <w:t xml:space="preserve">Teller: </w:t>
       </w:r>
-      <w:r>
-        <w:fldChar w:fldCharType="begin"/>
-      </w:r>
-      <w:r>
-        <w:instrText xml:space="preserve"> MERGEFIELD  Teller  \* MERGEFORMAT </w:instrText>
-      </w:r>
-      <w:r>
-        <w:fldChar w:fldCharType="separate"/>
-      </w:r>
-      <w:r>
-        <w:rPr>
-          <w:noProof/>
-        </w:rPr>
-        <w:t>«Teller»</w:t>
-      </w:r>
-      <w:r>
-        <w:rPr>
-          <w:noProof/>
-        </w:rPr>
-        <w:fldChar w:fldCharType="end"/>
-      </w:r>
+      <w:fldSimple w:instr=" MERGEFIELD  Teller  \* MERGEFORMAT ">
+        <w:r>
+          <w:rPr>
+            <w:noProof/>
+          </w:rPr>
+          <w:t>«Teller»</w:t>
+        </w:r>
+      </w:fldSimple>
     </w:p>
     <w:tbl>
       <w:tblPr>
@@ -97,8 +58,7 @@
         <w:gridCol w:w="751"/>
         <w:gridCol w:w="905"/>
         <w:gridCol w:w="553"/>
-        <w:gridCol w:w="821"/>
-        <w:gridCol w:w="4249"/>
+        <w:gridCol w:w="5070"/>
       </w:tblGrid>
       <w:tr>
         <w:tc>
@@ -127,34 +87,21 @@
         <w:tc>
           <w:tcPr>
             <w:tcW w:w="8310" w:type="dxa"/>
-            <w:gridSpan w:val="6"/>
+            <w:gridSpan w:val="5"/>
             <w:tcBorders>
               <w:left w:val="nil"/>
               <w:bottom w:val="single" w:sz="4" w:space="0" w:color="auto"/>
             </w:tcBorders>
           </w:tcPr>
           <w:p>
-            <w:r>
-              <w:fldChar w:fldCharType="begin"/>
-            </w:r>
-            <w:r>
-              <w:instrText xml:space="preserve"> MERGEFIELD  FullName  \* MERGEFORMAT </w:instrText>
-            </w:r>
-            <w:r>
-              <w:fldChar w:fldCharType="separate"/>
-            </w:r>
-            <w:r>
-              <w:rPr>
-                <w:noProof/>
-              </w:rPr>
-              <w:t>«FullName»</w:t>
-            </w:r>
-            <w:r>
-              <w:rPr>
-                <w:noProof/>
-              </w:rPr>
-              <w:fldChar w:fldCharType="end"/>
-            </w:r>
+            <w:fldSimple w:instr=" MERGEFIELD  FullName  \* MERGEFORMAT ">
+              <w:r>
+                <w:rPr>
+                  <w:noProof/>
+                </w:rPr>
+                <w:t>«FullName»</w:t>
+              </w:r>
+            </w:fldSimple>
           </w:p>
         </w:tc>
       </w:tr>
@@ -185,34 +132,21 @@
         <w:tc>
           <w:tcPr>
             <w:tcW w:w="8310" w:type="dxa"/>
-            <w:gridSpan w:val="6"/>
+            <w:gridSpan w:val="5"/>
             <w:tcBorders>
               <w:left w:val="nil"/>
               <w:bottom w:val="single" w:sz="4" w:space="0" w:color="auto"/>
             </w:tcBorders>
           </w:tcPr>
           <w:p>
-            <w:r>
-              <w:fldChar w:fldCharType="begin"/>
-            </w:r>
-            <w:r>
-              <w:instrText xml:space="preserve"> MERGEFIELD  FullAddress  \* MERGEFORMAT </w:instrText>
-            </w:r>
-            <w:r>
-              <w:fldChar w:fldCharType="separate"/>
-            </w:r>
-            <w:r>
-              <w:rPr>
-                <w:noProof/>
-              </w:rPr>
-              <w:t>«FullAddress»</w:t>
-            </w:r>
-            <w:r>
-              <w:rPr>
-                <w:noProof/>
-              </w:rPr>
-              <w:fldChar w:fldCharType="end"/>
-            </w:r>
+            <w:fldSimple w:instr=" MERGEFIELD  FullAddress  \* MERGEFORMAT ">
+              <w:r>
+                <w:rPr>
+                  <w:noProof/>
+                </w:rPr>
+                <w:t>«FullAddress»</w:t>
+              </w:r>
+            </w:fldSimple>
           </w:p>
         </w:tc>
       </w:tr>
@@ -241,39 +175,26 @@
         </w:tc>
         <w:tc>
           <w:tcPr>
-            <w:tcW w:w="1032" w:type="dxa"/>
+            <w:tcW w:w="1031" w:type="dxa"/>
             <w:tcBorders>
               <w:left w:val="nil"/>
               <w:right w:val="nil"/>
             </w:tcBorders>
           </w:tcPr>
           <w:p>
-            <w:r>
-              <w:fldChar w:fldCharType="begin"/>
-            </w:r>
-            <w:r>
-              <w:instrText xml:space="preserve"> MERGEFIELD  City  \* MERGEFORMAT </w:instrText>
-            </w:r>
-            <w:r>
-              <w:fldChar w:fldCharType="separate"/>
-            </w:r>
-            <w:r>
-              <w:rPr>
-                <w:noProof/>
-              </w:rPr>
-              <w:t>«City»</w:t>
-            </w:r>
-            <w:r>
-              <w:rPr>
-                <w:noProof/>
-              </w:rPr>
-              <w:fldChar w:fldCharType="end"/>
-            </w:r>
-          </w:p>
-        </w:tc>
-        <w:tc>
-          <w:tcPr>
-            <w:tcW w:w="739" w:type="dxa"/>
+            <w:fldSimple w:instr=" MERGEFIELD  City  \* MERGEFORMAT ">
+              <w:r>
+                <w:rPr>
+                  <w:noProof/>
+                </w:rPr>
+                <w:t>«City»</w:t>
+              </w:r>
+            </w:fldSimple>
+          </w:p>
+        </w:tc>
+        <w:tc>
+          <w:tcPr>
+            <w:tcW w:w="751" w:type="dxa"/>
             <w:tcBorders>
               <w:left w:val="nil"/>
               <w:right w:val="nil"/>
@@ -303,32 +224,19 @@
             </w:tcBorders>
           </w:tcPr>
           <w:p>
-            <w:r>
-              <w:fldChar w:fldCharType="begin"/>
-            </w:r>
-            <w:r>
-              <w:instrText xml:space="preserve"> MERGEFIELD  State  \* MERGEFORMAT </w:instrText>
-            </w:r>
-            <w:r>
-              <w:fldChar w:fldCharType="separate"/>
-            </w:r>
-            <w:r>
-              <w:rPr>
-                <w:noProof/>
-              </w:rPr>
-              <w:t>«State»</w:t>
-            </w:r>
-            <w:r>
-              <w:rPr>
-                <w:noProof/>
-              </w:rPr>
-              <w:fldChar w:fldCharType="end"/>
-            </w:r>
-          </w:p>
-        </w:tc>
-        <w:tc>
-          <w:tcPr>
-            <w:tcW w:w="544" w:type="dxa"/>
+            <w:fldSimple w:instr=" MERGEFIELD  State  \* MERGEFORMAT ">
+              <w:r>
+                <w:rPr>
+                  <w:noProof/>
+                </w:rPr>
+                <w:t>«State»</w:t>
+              </w:r>
+            </w:fldSimple>
+          </w:p>
+        </w:tc>
+        <w:tc>
+          <w:tcPr>
+            <w:tcW w:w="553" w:type="dxa"/>
             <w:tcBorders>
               <w:left w:val="nil"/>
               <w:right w:val="nil"/>
@@ -351,44 +259,21 @@
         </w:tc>
         <w:tc>
           <w:tcPr>
-            <w:tcW w:w="822" w:type="dxa"/>
+            <w:tcW w:w="5070" w:type="dxa"/>
             <w:tcBorders>
               <w:left w:val="nil"/>
-              <w:right w:val="nil"/>
-            </w:tcBorders>
-          </w:tcPr>
-          <w:p>
-            <w:r>
-              <w:fldChar w:fldCharType="begin"/>
-            </w:r>
-            <w:r>
-              <w:instrText xml:space="preserve"> MERGEFIELD  Zip  \* MERGEFORMAT </w:instrText>
-            </w:r>
-            <w:r>
-              <w:fldChar w:fldCharType="separate"/>
-            </w:r>
-            <w:r>
-              <w:rPr>
-                <w:noProof/>
-              </w:rPr>
-              <w:t>«Zip»</w:t>
-            </w:r>
-            <w:r>
-              <w:rPr>
-                <w:noProof/>
-              </w:rPr>
-              <w:fldChar w:fldCharType="end"/>
-            </w:r>
-          </w:p>
-        </w:tc>
-        <w:tc>
-          <w:tcPr>
-            <w:tcW w:w="4268" w:type="dxa"/>
-            <w:tcBorders>
-              <w:left w:val="nil"/>
-            </w:tcBorders>
-          </w:tcPr>
-          <w:p/>
+            </w:tcBorders>
+          </w:tcPr>
+          <w:p>
+            <w:fldSimple w:instr=" MERGEFIELD  Zip  \* MERGEFORMAT ">
+              <w:r>
+                <w:rPr>
+                  <w:noProof/>
+                </w:rPr>
+                <w:t>«Zip»</w:t>
+              </w:r>
+            </w:fldSimple>
+          </w:p>
         </w:tc>
       </w:tr>
     </w:tbl>
@@ -444,27 +329,14 @@
             </w:tcBorders>
           </w:tcPr>
           <w:p>
-            <w:r>
-              <w:fldChar w:fldCharType="begin"/>
-            </w:r>
-            <w:r>
-              <w:instrText xml:space="preserve"> MERGEFIELD  PaymentType  \* MERGEFORMAT </w:instrText>
-            </w:r>
-            <w:r>
-              <w:fldChar w:fldCharType="separate"/>
-            </w:r>
-            <w:r>
-              <w:rPr>
-                <w:noProof/>
-              </w:rPr>
-              <w:t>«PaymentType»</w:t>
-            </w:r>
-            <w:r>
-              <w:rPr>
-                <w:noProof/>
-              </w:rPr>
-              <w:fldChar w:fldCharType="end"/>
-            </w:r>
+            <w:fldSimple w:instr=" MERGEFIELD  PaymentType  \* MERGEFORMAT ">
+              <w:r>
+                <w:rPr>
+                  <w:noProof/>
+                </w:rPr>
+                <w:t>«PaymentType»</w:t>
+              </w:r>
+            </w:fldSimple>
           </w:p>
         </w:tc>
       </w:tr>
@@ -504,6 +376,9 @@
             <w:r>
               <w:t>$</w:t>
             </w:r>
+            <w:r>
+              <w:t xml:space="preserve"> </w:t>
+            </w:r>
             <w:bookmarkStart w:id="0" w:name="_GoBack"/>
             <w:bookmarkEnd w:id="0"/>
             <w:r>
@@ -561,27 +436,14 @@
             </w:tcBorders>
           </w:tcPr>
           <w:p>
-            <w:r>
-              <w:fldChar w:fldCharType="begin"/>
-            </w:r>
-            <w:r>
-              <w:instrText xml:space="preserve"> MERGEFIELD  PaymentDate  \* MERGEFORMAT </w:instrText>
-            </w:r>
-            <w:r>
-              <w:fldChar w:fldCharType="separate"/>
-            </w:r>
-            <w:r>
-              <w:rPr>
-                <w:noProof/>
-              </w:rPr>
-              <w:t>«PaymentDate»</w:t>
-            </w:r>
-            <w:r>
-              <w:rPr>
-                <w:noProof/>
-              </w:rPr>
-              <w:fldChar w:fldCharType="end"/>
-            </w:r>
+            <w:fldSimple w:instr=" MERGEFIELD  PaymentDate  \* MERGEFORMAT ">
+              <w:r>
+                <w:rPr>
+                  <w:noProof/>
+                </w:rPr>
+                <w:t>«PaymentDate»</w:t>
+              </w:r>
+            </w:fldSimple>
           </w:p>
         </w:tc>
       </w:tr>
@@ -600,27 +462,14 @@
       <w:r>
         <w:t xml:space="preserve">Comments: </w:t>
       </w:r>
-      <w:r>
-        <w:fldChar w:fldCharType="begin"/>
-      </w:r>
-      <w:r>
-        <w:instrText xml:space="preserve"> MERGEFIELD  Comments  \* MERGEFORMAT </w:instrText>
-      </w:r>
-      <w:r>
-        <w:fldChar w:fldCharType="separate"/>
-      </w:r>
-      <w:r>
-        <w:rPr>
-          <w:noProof/>
-        </w:rPr>
-        <w:t>«Comments»</w:t>
-      </w:r>
-      <w:r>
-        <w:rPr>
-          <w:noProof/>
-        </w:rPr>
-        <w:fldChar w:fldCharType="end"/>
-      </w:r>
+      <w:fldSimple w:instr=" MERGEFIELD  Comments  \* MERGEFORMAT ">
+        <w:r>
+          <w:rPr>
+            <w:noProof/>
+          </w:rPr>
+          <w:t>«Comments»</w:t>
+        </w:r>
+      </w:fldSimple>
     </w:p>
     <w:sectPr>
       <w:headerReference w:type="default" r:id="rId7"/>
@@ -769,7 +618,7 @@
         <w:noProof/>
         <w:sz w:val="20"/>
       </w:rPr>
-      <w:t>Wednesday, October 14, 2026</w:t>
+      <w:t>Thursday, October 15, 2026</w:t>
     </w:r>
     <w:r>
       <w:rPr>
@@ -1573,7 +1422,7 @@
 </file>
 
 <file path=customXml/itemProps1.xml><?xml version="1.0" encoding="utf-8"?>
-<ds:datastoreItem xmlns:ds="http://schemas.openxmlformats.org/officeDocument/2006/customXml" ds:itemID="{67AD3978-D974-4FE8-9109-5093C9510DFB}">
+<ds:datastoreItem xmlns:ds="http://schemas.openxmlformats.org/officeDocument/2006/customXml" ds:itemID="{349EFB62-ACEC-46FF-993C-0F99AED4CF88}">
   <ds:schemaRefs>
     <ds:schemaRef ds:uri="http://schemas.openxmlformats.org/officeDocument/2006/bibliography"/>
   </ds:schemaRefs>

</xml_diff>